<commit_message>
Deploy latest version of PFS documents c16c1b3b9acc87278badb84d32e2cd09a797cbab
</commit_message>
<xml_diff>
--- a/latest/SR.docx
+++ b/latest/SR.docx
@@ -49,13 +49,13 @@
         </w:drawing>
       </w:r>
     </w:p>
-    <w:bookmarkStart w:id="194" w:name="ceos-ard---optical---aquatic-reflectance"/>
+    <w:bookmarkStart w:id="196" w:name="ceos-ard---optical---surface-reflectance"/>
     <w:p>
       <w:pPr>
         <w:pStyle w:val="berschrift1"/>
       </w:pPr>
       <w:r>
-        <w:t xml:space="preserve">CEOS-ARD - Optical - Aquatic Reflectance</w:t>
+        <w:t xml:space="preserve">CEOS-ARD - Optical - Surface Reflectance</w:t>
       </w:r>
     </w:p>
     <w:p>
@@ -80,7 +80,7 @@
         <w:pStyle w:val="FirstParagraph"/>
       </w:pPr>
       <w:r>
-        <w:t xml:space="preserve">Product Family Specification, Optical, Aquatic Reflectance</w:t>
+        <w:t xml:space="preserve">Product Family Specification, Optical, Surface Reflectance</w:t>
       </w:r>
     </w:p>
     <w:p>
@@ -396,7 +396,7 @@
         <w:t xml:space="preserve"> </w:t>
       </w:r>
       <w:r>
-        <w:t xml:space="preserve">Optical, Aquatic Reflectance (SR)</w:t>
+        <w:t xml:space="preserve">Optical, Surface Reflectance (SR)</w:t>
       </w:r>
     </w:p>
     <w:p>
@@ -414,7 +414,7 @@
         <w:t xml:space="preserve"> </w:t>
       </w:r>
       <w:r>
-        <w:t xml:space="preserve">2.0-draft</w:t>
+        <w:t xml:space="preserve">5.0.1-draft</w:t>
       </w:r>
     </w:p>
     <w:p>
@@ -450,7 +450,7 @@
         <w:pStyle w:val="FirstParagraph"/>
       </w:pPr>
       <w:r>
-        <w:t xml:space="preserve">Data collected with multispectral and hyperspectral imaging sensors operating in the VIS/NIR/SWIR wavelengths over water bodies (including oceans, seas, coastal zones, and inland waters). These typically operate with ground sample distance and resolution in the order of 1-4000 metres however the specification is not inherently limited to these resolutions.</w:t>
+        <w:t xml:space="preserve">Data collected with multispectral optical sensors operating in the VIS/NIR/SWIR wavelengths at all ground sample distances and resolutions.</w:t>
       </w:r>
     </w:p>
     <w:p>
@@ -473,7 +473,7 @@
         <w:pStyle w:val="DefinitionTerm"/>
       </w:pPr>
       <w:r>
-        <w:t xml:space="preserve">AR</w:t>
+        <w:t xml:space="preserve">ATBD</w:t>
       </w:r>
     </w:p>
     <w:p>
@@ -481,7 +481,7 @@
         <w:pStyle w:val="Definition"/>
       </w:pPr>
       <w:r>
-        <w:t xml:space="preserve">Aquatic Reflectance</w:t>
+        <w:t xml:space="preserve">Algorithm Theoretical Basis Document</w:t>
       </w:r>
     </w:p>
     <w:p>
@@ -489,7 +489,7 @@
         <w:pStyle w:val="DefinitionTerm"/>
       </w:pPr>
       <w:r>
-        <w:t xml:space="preserve">ATBD</w:t>
+        <w:t xml:space="preserve">Auxiliary Data</w:t>
       </w:r>
     </w:p>
     <w:p>
@@ -497,7 +497,7 @@
         <w:pStyle w:val="Definition"/>
       </w:pPr>
       <w:r>
-        <w:t xml:space="preserve">Algorithm Theoretical Basis Document</w:t>
+        <w:t xml:space="preserve">The data required for instrument processing, which does not originate in the instrument itself or from the satellite. Some auxiliary data will be generated in the ground segment, whilst other data will be provided from external sources, e.g., DEM, aerosols.</w:t>
       </w:r>
     </w:p>
     <w:p>
@@ -505,7 +505,7 @@
         <w:pStyle w:val="DefinitionTerm"/>
       </w:pPr>
       <w:r>
-        <w:t xml:space="preserve">Auxiliary Data</w:t>
+        <w:t xml:space="preserve">BRDF</w:t>
       </w:r>
     </w:p>
     <w:p>
@@ -513,7 +513,7 @@
         <w:pStyle w:val="Definition"/>
       </w:pPr>
       <w:r>
-        <w:t xml:space="preserve">The data required for instrument processing, which does not originate in the instrument itself or from the satellite. Some auxiliary data will be generated in the ground segment, whilst other data will be provided from external sources, e.g., DEM, aerosols.</w:t>
+        <w:t xml:space="preserve">Bi-Directional Reflectance Function</w:t>
       </w:r>
     </w:p>
     <w:p>
@@ -521,7 +521,7 @@
         <w:pStyle w:val="DefinitionTerm"/>
       </w:pPr>
       <w:r>
-        <w:t xml:space="preserve">BRDF</w:t>
+        <w:t xml:space="preserve">CEOS-ARD</w:t>
       </w:r>
     </w:p>
     <w:p>
@@ -529,7 +529,7 @@
         <w:pStyle w:val="Definition"/>
       </w:pPr>
       <w:r>
-        <w:t xml:space="preserve">Bi-Directional Reflectance Function</w:t>
+        <w:t xml:space="preserve">Committee on Earth Observation Satellites - Analysis Ready Data</w:t>
       </w:r>
     </w:p>
     <w:p>
@@ -537,7 +537,7 @@
         <w:pStyle w:val="DefinitionTerm"/>
       </w:pPr>
       <w:r>
-        <w:t xml:space="preserve">CEOS-ARD</w:t>
+        <w:t xml:space="preserve">CEP</w:t>
       </w:r>
     </w:p>
     <w:p>
@@ -545,7 +545,7 @@
         <w:pStyle w:val="Definition"/>
       </w:pPr>
       <w:r>
-        <w:t xml:space="preserve">Committee on Earth Observation Satellites - Analysis Ready Data</w:t>
+        <w:t xml:space="preserve">Circular Error Probability, often provided with an additional percentage (e.g. CEP90 for 90% probability)</w:t>
       </w:r>
     </w:p>
     <w:p>
@@ -553,7 +553,7 @@
         <w:pStyle w:val="DefinitionTerm"/>
       </w:pPr>
       <w:r>
-        <w:t xml:space="preserve">CEP</w:t>
+        <w:t xml:space="preserve">DEM</w:t>
       </w:r>
     </w:p>
     <w:p>
@@ -561,7 +561,7 @@
         <w:pStyle w:val="Definition"/>
       </w:pPr>
       <w:r>
-        <w:t xml:space="preserve">Circular Error Probability, often provided with an additional percentage (e.g. CEP90 for 90% probability)</w:t>
+        <w:t xml:space="preserve">Digital Elevation Model</w:t>
       </w:r>
     </w:p>
     <w:p>
@@ -569,7 +569,7 @@
         <w:pStyle w:val="DefinitionTerm"/>
       </w:pPr>
       <w:r>
-        <w:t xml:space="preserve">DEM</w:t>
+        <w:t xml:space="preserve">DOI</w:t>
       </w:r>
     </w:p>
     <w:p>
@@ -577,7 +577,7 @@
         <w:pStyle w:val="Definition"/>
       </w:pPr>
       <w:r>
-        <w:t xml:space="preserve">Digital Elevation Model</w:t>
+        <w:t xml:space="preserve">Digital Object Identifier</w:t>
       </w:r>
     </w:p>
     <w:p>
@@ -585,7 +585,7 @@
         <w:pStyle w:val="DefinitionTerm"/>
       </w:pPr>
       <w:r>
-        <w:t xml:space="preserve">DOI</w:t>
+        <w:t xml:space="preserve">GIS</w:t>
       </w:r>
     </w:p>
     <w:p>
@@ -593,7 +593,7 @@
         <w:pStyle w:val="Definition"/>
       </w:pPr>
       <w:r>
-        <w:t xml:space="preserve">Digital Object Identifier</w:t>
+        <w:t xml:space="preserve">Geographic Information System</w:t>
       </w:r>
     </w:p>
     <w:p>
@@ -601,7 +601,7 @@
         <w:pStyle w:val="DefinitionTerm"/>
       </w:pPr>
       <w:r>
-        <w:t xml:space="preserve">GIS</w:t>
+        <w:t xml:space="preserve">NIR</w:t>
       </w:r>
     </w:p>
     <w:p>
@@ -609,7 +609,7 @@
         <w:pStyle w:val="Definition"/>
       </w:pPr>
       <w:r>
-        <w:t xml:space="preserve">Geographic Information System</w:t>
+        <w:t xml:space="preserve">Near Infrared</w:t>
       </w:r>
     </w:p>
     <w:p>
@@ -617,7 +617,7 @@
         <w:pStyle w:val="DefinitionTerm"/>
       </w:pPr>
       <w:r>
-        <w:t xml:space="preserve">NIR</w:t>
+        <w:t xml:space="preserve">RMSE</w:t>
       </w:r>
     </w:p>
     <w:p>
@@ -625,7 +625,7 @@
         <w:pStyle w:val="Definition"/>
       </w:pPr>
       <w:r>
-        <w:t xml:space="preserve">Near Infrared</w:t>
+        <w:t xml:space="preserve">Root Mean Square Error</w:t>
       </w:r>
     </w:p>
     <w:p>
@@ -633,7 +633,7 @@
         <w:pStyle w:val="DefinitionTerm"/>
       </w:pPr>
       <w:r>
-        <w:t xml:space="preserve">RMSE</w:t>
+        <w:t xml:space="preserve">rRMSE</w:t>
       </w:r>
     </w:p>
     <w:p>
@@ -641,7 +641,7 @@
         <w:pStyle w:val="Definition"/>
       </w:pPr>
       <w:r>
-        <w:t xml:space="preserve">Root Mean Square Error</w:t>
+        <w:t xml:space="preserve">Radial Root Mean Square Error</w:t>
       </w:r>
     </w:p>
     <w:p>
@@ -649,7 +649,7 @@
         <w:pStyle w:val="DefinitionTerm"/>
       </w:pPr>
       <w:r>
-        <w:t xml:space="preserve">rRMSE</w:t>
+        <w:t xml:space="preserve">SI</w:t>
       </w:r>
     </w:p>
     <w:p>
@@ -657,7 +657,7 @@
         <w:pStyle w:val="Definition"/>
       </w:pPr>
       <w:r>
-        <w:t xml:space="preserve">Radial Root Mean Square Error</w:t>
+        <w:t xml:space="preserve">International System of Units, internationally known by the abbreviation SI (from French Système international d’unités)</w:t>
       </w:r>
     </w:p>
     <w:p>
@@ -665,7 +665,7 @@
         <w:pStyle w:val="DefinitionTerm"/>
       </w:pPr>
       <w:r>
-        <w:t xml:space="preserve">SI</w:t>
+        <w:t xml:space="preserve">SR</w:t>
       </w:r>
     </w:p>
     <w:p>
@@ -673,7 +673,7 @@
         <w:pStyle w:val="Definition"/>
       </w:pPr>
       <w:r>
-        <w:t xml:space="preserve">International System of Units, internationally known by the abbreviation SI (from French Système international d’unités)</w:t>
+        <w:t xml:space="preserve">Surface Reflectance</w:t>
       </w:r>
     </w:p>
     <w:p>
@@ -9113,7 +9113,7 @@
     </w:p>
     <w:bookmarkEnd w:id="189"/>
     <w:bookmarkEnd w:id="190"/>
-    <w:bookmarkStart w:id="193" w:name="references"/>
+    <w:bookmarkStart w:id="195" w:name="references"/>
     <w:p>
       <w:pPr>
         <w:pStyle w:val="berschrift2"/>
@@ -9122,7 +9122,7 @@
         <w:t xml:space="preserve">References</w:t>
       </w:r>
     </w:p>
-    <w:bookmarkStart w:id="192" w:name="refs"/>
+    <w:bookmarkStart w:id="194" w:name="refs"/>
     <w:bookmarkStart w:id="191" w:name="ref-iso19115_2_2009"/>
     <w:p>
       <w:pPr>
@@ -9151,9 +9151,52 @@
       </w:r>
     </w:p>
     <w:bookmarkEnd w:id="191"/>
-    <w:bookmarkEnd w:id="192"/>
+    <w:bookmarkStart w:id="193" w:name="ref-li2012"/>
+    <w:p>
+      <w:pPr>
+        <w:pStyle w:val="Literaturverzeichnis"/>
+      </w:pPr>
+      <w:r>
+        <w:t xml:space="preserve">Li, Fuqin, David L. B. Jupp, Medhavy Thankappan, Leo Lymburner, Norman Mueller, Adam Lewis, and Alex Held. 2012.</w:t>
+      </w:r>
+      <w:r>
+        <w:t xml:space="preserve"> </w:t>
+      </w:r>
+      <w:r>
+        <w:t xml:space="preserve">“A Physics-Based Atmospheric and BRDF Correction for Landsat Data over Mountainous Terrain.”</w:t>
+      </w:r>
+      <w:r>
+        <w:t xml:space="preserve"> </w:t>
+      </w:r>
+      <w:r>
+        <w:rPr>
+          <w:i/>
+          <w:iCs/>
+        </w:rPr>
+        <w:t xml:space="preserve">Remote Sensing of Environment</w:t>
+      </w:r>
+      <w:r>
+        <w:t xml:space="preserve"> </w:t>
+      </w:r>
+      <w:r>
+        <w:t xml:space="preserve">124: 756–70. https://doi.org/</w:t>
+      </w:r>
+      <w:hyperlink r:id="rId192">
+        <w:r>
+          <w:rPr>
+            <w:rStyle w:val="Hyperlink"/>
+          </w:rPr>
+          <w:t xml:space="preserve">https://doi.org/10.1016/j.rse.2012.06.018</w:t>
+        </w:r>
+      </w:hyperlink>
+      <w:r>
+        <w:t xml:space="preserve">.</w:t>
+      </w:r>
+    </w:p>
     <w:bookmarkEnd w:id="193"/>
     <w:bookmarkEnd w:id="194"/>
+    <w:bookmarkEnd w:id="195"/>
+    <w:bookmarkEnd w:id="196"/>
     <w:sectPr>
       <w:headerReference r:id="rId11" w:type="even"/>
       <w:headerReference r:id="rId10" w:type="default"/>

</xml_diff>